<commit_message>
Update scholarship MOU template
Replace counselor_tracker/public/templates/scholarship-mou.docx with an updated binary .docx template containing revisions to the scholarship Memorandum of Understanding. No code changes.
</commit_message>
<xml_diff>
--- a/counselor_tracker/public/templates/scholarship-mou.docx
+++ b/counselor_tracker/public/templates/scholarship-mou.docx
@@ -225,18 +225,8 @@
           <w:sz w:val="24"/>
           <w:szCs w:val="24"/>
         </w:rPr>
-        <w:t>Partner"; and collectively, shall be referred to as "the Authorities</w:t>
-      </w:r>
-      <w:proofErr w:type="gramStart"/>
-      <w:r>
-        <w:rPr>
-          <w:rFonts w:ascii="Georgia" w:eastAsia="Georgia" w:hAnsi="Georgia" w:cs="Georgia"/>
-          <w:sz w:val="24"/>
-          <w:szCs w:val="24"/>
-        </w:rPr>
-        <w:t>";</w:t>
-      </w:r>
-      <w:proofErr w:type="gramEnd"/>
+        <w:t>Partner"; and collectively, shall be referred to as "the Authorities";</w:t>
+      </w:r>
     </w:p>
     <w:p>
       <w:pPr>
@@ -607,10 +597,20 @@
       <w:pPr>
         <w:rPr>
           <w:rFonts w:ascii="Georgia" w:eastAsia="Georgia" w:hAnsi="Georgia" w:cs="Georgia"/>
-          <w:sz w:val="24"/>
-          <w:szCs w:val="24"/>
-        </w:rPr>
-      </w:pPr>
+          <w:b/>
+          <w:bCs/>
+          <w:sz w:val="24"/>
+          <w:szCs w:val="24"/>
+        </w:rPr>
+      </w:pPr>
+      <w:r>
+        <w:rPr>
+          <w:rFonts w:ascii="Georgia" w:eastAsia="Georgia" w:hAnsi="Georgia" w:cs="Georgia"/>
+          <w:sz w:val="24"/>
+          <w:szCs w:val="24"/>
+        </w:rPr>
+        <w:br w:type="page"/>
+      </w:r>
     </w:p>
     <w:p>
       <w:pPr>
@@ -625,83 +625,6 @@
           <w:szCs w:val="24"/>
         </w:rPr>
       </w:pPr>
-      <w:r>
-        <w:rPr>
-          <w:rFonts w:ascii="Georgia" w:eastAsia="Georgia" w:hAnsi="Georgia" w:cs="Georgia"/>
-          <w:sz w:val="24"/>
-          <w:szCs w:val="24"/>
-        </w:rPr>
-        <w:t>5. Governing Rules</w:t>
-      </w:r>
-    </w:p>
-    <w:p>
-      <w:pPr>
-        <w:pStyle w:val="Heading1"/>
-        <w:tabs>
-          <w:tab w:val="left" w:pos="320"/>
-        </w:tabs>
-        <w:rPr>
-          <w:rFonts w:ascii="Georgia" w:eastAsia="Georgia" w:hAnsi="Georgia" w:cs="Georgia"/>
-          <w:sz w:val="24"/>
-          <w:szCs w:val="24"/>
-        </w:rPr>
-      </w:pPr>
-    </w:p>
-    <w:p>
-      <w:pPr>
-        <w:rPr>
-          <w:rFonts w:ascii="Georgia" w:eastAsia="Georgia" w:hAnsi="Georgia" w:cs="Georgia"/>
-          <w:sz w:val="24"/>
-          <w:szCs w:val="24"/>
-        </w:rPr>
-      </w:pPr>
-      <w:r>
-        <w:rPr>
-          <w:rFonts w:ascii="Georgia" w:eastAsia="Georgia" w:hAnsi="Georgia" w:cs="Georgia"/>
-          <w:sz w:val="24"/>
-          <w:szCs w:val="24"/>
-        </w:rPr>
-        <w:t xml:space="preserve">The Company &amp; the Partner shall not be entitled to a commission unless and until the student who was first </w:t>
-      </w:r>
-      <w:proofErr w:type="gramStart"/>
-      <w:r>
-        <w:rPr>
-          <w:rFonts w:ascii="Georgia" w:eastAsia="Georgia" w:hAnsi="Georgia" w:cs="Georgia"/>
-          <w:sz w:val="24"/>
-          <w:szCs w:val="24"/>
-        </w:rPr>
-        <w:t>referred</w:t>
-      </w:r>
-      <w:proofErr w:type="gramEnd"/>
-      <w:r>
-        <w:rPr>
-          <w:rFonts w:ascii="Georgia" w:eastAsia="Georgia" w:hAnsi="Georgia" w:cs="Georgia"/>
-          <w:sz w:val="24"/>
-          <w:szCs w:val="24"/>
-        </w:rPr>
-        <w:t xml:space="preserve"> by either the Company or the Partner has fully and finally paid non</w:t>
-      </w:r>
-      <w:proofErr w:type="gramStart"/>
-      <w:r>
-        <w:rPr>
-          <w:rFonts w:ascii="Georgia" w:eastAsia="Georgia" w:hAnsi="Georgia" w:cs="Georgia"/>
-          <w:sz w:val="24"/>
-          <w:szCs w:val="24"/>
-        </w:rPr>
-        <w:t>- refundable</w:t>
-      </w:r>
-      <w:proofErr w:type="gramEnd"/>
-      <w:r>
-        <w:rPr>
-          <w:rFonts w:ascii="Georgia" w:eastAsia="Georgia" w:hAnsi="Georgia" w:cs="Georgia"/>
-          <w:sz w:val="24"/>
-          <w:szCs w:val="24"/>
-        </w:rPr>
-        <w:t xml:space="preserve"> tuition to the Service Partner.</w:t>
-      </w:r>
-      <w:r>
-        <w:br w:type="page"/>
-      </w:r>
     </w:p>
     <w:p>
       <w:pPr>
@@ -722,7 +645,6 @@
           <w:sz w:val="24"/>
           <w:szCs w:val="24"/>
         </w:rPr>
-        <w:lastRenderedPageBreak/>
         <w:t>6. Financial Arrangements</w:t>
       </w:r>
     </w:p>
@@ -2793,7 +2715,7 @@
               </wp:anchor>
             </w:drawing>
           </mc:Choice>
-          <mc:Fallback xmlns:cr="http://schemas.microsoft.com/office/comments/2020/reactions" xmlns="http://schemas.microsoft.com/office/tasks/2019/documenttasks" xmlns:dgm="http://schemas.openxmlformats.org/drawingml/2006/diagram" xmlns:lc="http://schemas.openxmlformats.org/drawingml/2006/lockedCanvas" xmlns:c="http://schemas.openxmlformats.org/drawingml/2006/chart" xmlns:pic="http://schemas.openxmlformats.org/drawingml/2006/picture" xmlns:a="http://schemas.openxmlformats.org/drawingml/2006/main" xmlns:sl="http://schemas.openxmlformats.org/schemaLibrary/2006/main">
+          <mc:Fallback xmlns:sl="http://schemas.openxmlformats.org/schemaLibrary/2006/main" xmlns:a="http://schemas.openxmlformats.org/drawingml/2006/main" xmlns:pic="http://schemas.openxmlformats.org/drawingml/2006/picture" xmlns:c="http://schemas.openxmlformats.org/drawingml/2006/chart" xmlns:lc="http://schemas.openxmlformats.org/drawingml/2006/lockedCanvas" xmlns:dgm="http://schemas.openxmlformats.org/drawingml/2006/diagram" xmlns="http://schemas.microsoft.com/office/tasks/2019/documenttasks" xmlns:cr="http://schemas.microsoft.com/office/comments/2020/reactions">
             <w:drawing>
               <wp:anchor allowOverlap="1" behindDoc="0" distB="0" distT="0" distL="0" distR="0" hidden="0" layoutInCell="1" locked="0" relativeHeight="0" simplePos="0">
                 <wp:simplePos x="0" y="0"/>

</xml_diff>